<commit_message>
Add didactic assembly QC figure (N50, BUSCO, TransDecoder, CD-HIT-EST)
- 04_functional_analysis/plot_assembly_qc.py: novo painel 4-em-1 com dados
  verificados nos arquivos reais (trinity_stats2.txt, BUSCO short_summary,
  headers do .transdecoder.pep) - curva Nx, completude BUSCO, tipos de ORF
  e contagem transcritos->proteinas apos CD-HIT-EST 95%.
- Inserida como Figura 1 na Secao 3.1 do artigo.md; demais figuras
  renumeradas (2-5) no script de geracao do Word.
- artigo.docx regenerado com as 5 figuras.
</commit_message>
<xml_diff>
--- a/artigo.docx
+++ b/artigo.docx
@@ -1024,6 +1024,58 @@
     </w:p>
     <w:p>
       <w:pPr>
+        <w:jc w:val="center"/>
+      </w:pPr>
+      <w:r>
+        <w:drawing>
+          <wp:inline xmlns:a="http://schemas.openxmlformats.org/drawingml/2006/main" xmlns:pic="http://schemas.openxmlformats.org/drawingml/2006/picture">
+            <wp:extent cx="5760720" cy="4321773"/>
+            <wp:docPr id="1" name="Picture 1"/>
+            <wp:cNvGraphicFramePr>
+              <a:graphicFrameLocks noChangeAspect="1"/>
+            </wp:cNvGraphicFramePr>
+            <a:graphic>
+              <a:graphicData uri="http://schemas.openxmlformats.org/drawingml/2006/picture">
+                <pic:pic>
+                  <pic:nvPicPr>
+                    <pic:cNvPr id="0" name="assembly_qc_summary.png"/>
+                    <pic:cNvPicPr/>
+                  </pic:nvPicPr>
+                  <pic:blipFill>
+                    <a:blip r:embed="rId9"/>
+                    <a:stretch>
+                      <a:fillRect/>
+                    </a:stretch>
+                  </pic:blipFill>
+                  <pic:spPr>
+                    <a:xfrm>
+                      <a:off x="0" y="0"/>
+                      <a:ext cx="5760720" cy="4321773"/>
+                    </a:xfrm>
+                    <a:prstGeom prst="rect"/>
+                  </pic:spPr>
+                </pic:pic>
+              </a:graphicData>
+            </a:graphic>
+          </wp:inline>
+        </w:drawing>
+      </w:r>
+    </w:p>
+    <w:p>
+      <w:pPr>
+        <w:spacing w:after="240"/>
+        <w:jc w:val="both"/>
+      </w:pPr>
+      <w:r>
+        <w:rPr>
+          <w:i/>
+          <w:sz w:val="18"/>
+        </w:rPr>
+        <w:t>Figura 1. Painel didatico de controle de qualidade da montagem e predicao de proteinas. (A) Numero de sequencias em cada etapa: transcritos nao-redundantes apos Trinity + CD-HIT-EST a 95% de identidade (103.560, 90.344 genes, GC 34,21%; 12.857 transcritos colapsados por redundancia) e proteinas preditas por TransDecoder (--single_best_only; 12.445). (B) Curva Nx dos contigs montados (N10-N50): N50 = 738 pb, ou seja, metade das bases montadas esta em contigs de pelo menos 738 pb. (C) Completude BUSCO (insecta_odb10, n=1.367): C:96,2% [S:39,9%, D:56,3%], F:1,9%, M:1,9%. (D) Distribuicao dos tipos de ORF preditos pelo TransDecoder: completo (7.262; 58,4%), 5'-parcial (2.026; 16,3%), interno (1.986; 16,0%) e 3'-parcial (1.171; 9,4%).</w:t>
+      </w:r>
+    </w:p>
+    <w:p>
+      <w:pPr>
         <w:pStyle w:val="Heading3"/>
       </w:pPr>
       <w:r>
@@ -1065,7 +1117,7 @@
         <w:drawing>
           <wp:inline xmlns:a="http://schemas.openxmlformats.org/drawingml/2006/main" xmlns:pic="http://schemas.openxmlformats.org/drawingml/2006/picture">
             <wp:extent cx="5760720" cy="2764338"/>
-            <wp:docPr id="1" name="Picture 1"/>
+            <wp:docPr id="2" name="Picture 2"/>
             <wp:cNvGraphicFramePr>
               <a:graphicFrameLocks noChangeAspect="1"/>
             </wp:cNvGraphicFramePr>
@@ -1077,7 +1129,7 @@
                     <pic:cNvPicPr/>
                   </pic:nvPicPr>
                   <pic:blipFill>
-                    <a:blip r:embed="rId9"/>
+                    <a:blip r:embed="rId10"/>
                     <a:stretch>
                       <a:fillRect/>
                     </a:stretch>
@@ -1106,7 +1158,7 @@
           <w:i/>
           <w:sz w:val="18"/>
         </w:rPr>
-        <w:t>Figura 1. Cobertura da anotacao funcional e origem taxonomica das 12.445 proteinas preditas (dados corrigidos pos-fix do bug de merge de anotacao, Secao 3.2). (A) Proporcao de proteinas anotadas por fonte: dominio Pfam (62,1%), ortologo KEGG (42,6%), termo GO (44,0%) e hit DIAMOND contra o NCBI NR (75,1%). (B) Distribuicao taxonomica dos melhores hits DIAMOND: Eukaryota (8.711; 70,0%), nao classificado (3.164; 25,4%), Bacteria (540; 4,3%), Fungi (256; 2,1%) e Viruses (30; 0,2%).</w:t>
+        <w:t>Figura 2. Cobertura da anotacao funcional e origem taxonomica das 12.445 proteinas preditas (dados corrigidos pos-fix do bug de merge de anotacao, Secao 3.2). (A) Proporcao de proteinas anotadas por fonte: dominio Pfam (62,1%), ortologo KEGG (42,6%), termo GO (44,0%) e hit DIAMOND contra o NCBI NR (75,1%). (B) Distribuicao taxonomica dos melhores hits DIAMOND: Eukaryota (8.711; 70,0%), nao classificado (3.164; 25,4%), Bacteria (540; 4,3%), Fungi (256; 2,1%) e Viruses (30; 0,2%).</w:t>
       </w:r>
     </w:p>
     <w:p>
@@ -1125,7 +1177,7 @@
         <w:drawing>
           <wp:inline xmlns:a="http://schemas.openxmlformats.org/drawingml/2006/main" xmlns:pic="http://schemas.openxmlformats.org/drawingml/2006/picture">
             <wp:extent cx="5760720" cy="2642473"/>
-            <wp:docPr id="2" name="Picture 2"/>
+            <wp:docPr id="3" name="Picture 3"/>
             <wp:cNvGraphicFramePr>
               <a:graphicFrameLocks noChangeAspect="1"/>
             </wp:cNvGraphicFramePr>
@@ -1137,7 +1189,7 @@
                     <pic:cNvPicPr/>
                   </pic:nvPicPr>
                   <pic:blipFill>
-                    <a:blip r:embed="rId10"/>
+                    <a:blip r:embed="rId11"/>
                     <a:stretch>
                       <a:fillRect/>
                     </a:stretch>
@@ -1166,7 +1218,7 @@
           <w:i/>
           <w:sz w:val="18"/>
         </w:rPr>
-        <w:t>Figura 2. Distribuicao dos 20 termos GO mais frequentes por categoria entre as 12.445 proteinas preditas (profundidade GO &gt;= 3). Paineis: Processo Biologico, Funcao Molecular e Componente Celular, com o numero de proteinas e a porcentagem associada a cada termo.</w:t>
+        <w:t>Figura 3. Distribuicao dos 20 termos GO mais frequentes por categoria entre as 12.445 proteinas preditas (profundidade GO &gt;= 3). Paineis: Processo Biologico, Funcao Molecular e Componente Celular, com o numero de proteinas e a porcentagem associada a cada termo.</w:t>
       </w:r>
     </w:p>
     <w:p>
@@ -1185,7 +1237,7 @@
         <w:drawing>
           <wp:inline xmlns:a="http://schemas.openxmlformats.org/drawingml/2006/main" xmlns:pic="http://schemas.openxmlformats.org/drawingml/2006/picture">
             <wp:extent cx="5760720" cy="3654726"/>
-            <wp:docPr id="3" name="Picture 3"/>
+            <wp:docPr id="4" name="Picture 4"/>
             <wp:cNvGraphicFramePr>
               <a:graphicFrameLocks noChangeAspect="1"/>
             </wp:cNvGraphicFramePr>
@@ -1197,7 +1249,7 @@
                     <pic:cNvPicPr/>
                   </pic:nvPicPr>
                   <pic:blipFill>
-                    <a:blip r:embed="rId11"/>
+                    <a:blip r:embed="rId12"/>
                     <a:stretch>
                       <a:fillRect/>
                     </a:stretch>
@@ -1226,7 +1278,7 @@
           <w:i/>
           <w:sz w:val="18"/>
         </w:rPr>
-        <w:t>Figura 3. Top 20 vias KEGG mais representadas entre as proteinas anotadas, coloridas por categoria funcional KEGG (Cellular Processes, Environmental/Genetic Information Processing, Human Diseases, Metabolism, Organismal Systems, Other). Via mais frequente: Metabolic pathways (845 proteinas, 6,8%), seguida por Biosynthesis of secondary metabolites (388; 3,1%) e Ribosome (261; 2,1%).</w:t>
+        <w:t>Figura 4. Top 20 vias KEGG mais representadas entre as proteinas anotadas, coloridas por categoria funcional KEGG (Cellular Processes, Environmental/Genetic Information Processing, Human Diseases, Metabolism, Organismal Systems, Other). Via mais frequente: Metabolic pathways (845 proteinas, 6,8%), seguida por Biosynthesis of secondary metabolites (388; 3,1%) e Ribosome (261; 2,1%).</w:t>
       </w:r>
     </w:p>
     <w:p>
@@ -1237,7 +1289,7 @@
         <w:drawing>
           <wp:inline xmlns:a="http://schemas.openxmlformats.org/drawingml/2006/main" xmlns:pic="http://schemas.openxmlformats.org/drawingml/2006/picture">
             <wp:extent cx="5760720" cy="3295797"/>
-            <wp:docPr id="4" name="Picture 4"/>
+            <wp:docPr id="5" name="Picture 5"/>
             <wp:cNvGraphicFramePr>
               <a:graphicFrameLocks noChangeAspect="1"/>
             </wp:cNvGraphicFramePr>
@@ -1249,7 +1301,7 @@
                     <pic:cNvPicPr/>
                   </pic:nvPicPr>
                   <pic:blipFill>
-                    <a:blip r:embed="rId12"/>
+                    <a:blip r:embed="rId13"/>
                     <a:stretch>
                       <a:fillRect/>
                     </a:stretch>
@@ -1278,7 +1330,7 @@
           <w:i/>
           <w:sz w:val="18"/>
         </w:rPr>
-        <w:t>Figura 4. Distribuicao das 30 vias KEGG mais representadas, agrupadas por categoria funcional (eixo x) e numero de proteinas associadas (eixo y; tamanho do circulo proporcional a contagem). Complementa a Figura 3 ao evidenciar a dispersao de vias dentro de cada categoria KEGG.</w:t>
+        <w:t>Figura 5. Distribuicao das 30 vias KEGG mais representadas, agrupadas por categoria funcional (eixo x) e numero de proteinas associadas (eixo y; tamanho do circulo proporcional a contagem). Complementa a Figura 4 ao evidenciar a dispersao de vias dentro de cada categoria KEGG.</w:t>
       </w:r>
     </w:p>
     <w:p>

</xml_diff>

<commit_message>
Fix figures not rendering in artigo.docx (exact line-spacing clipping)
O estilo 'Normal' usa espacamento de linha EXATO (Pt(18), ~1.5) para o
corpo do texto. Paragrafos de imagem herdavam essa regra, entao o Word
cortava cada figura para caber numa linha de 18pt, deixando visivel so
uma fatia (geralmente a legenda). Corrigido definindo
line_spacing_rule=SINGLE nos paragrafos de imagem/legenda em
insert_figure(). Verificado abrindo o docx de verdade via Word COM e
exportando para PDF: as 5 figuras aparecem completas.
</commit_message>
<xml_diff>
--- a/artigo.docx
+++ b/artigo.docx
@@ -1024,6 +1024,7 @@
     </w:p>
     <w:p>
       <w:pPr>
+        <w:spacing w:line="240" w:lineRule="auto"/>
         <w:jc w:val="center"/>
       </w:pPr>
       <w:r>
@@ -1063,7 +1064,7 @@
     </w:p>
     <w:p>
       <w:pPr>
-        <w:spacing w:after="240"/>
+        <w:spacing w:line="240" w:lineRule="auto" w:after="240"/>
         <w:jc w:val="both"/>
       </w:pPr>
       <w:r>
@@ -1111,6 +1112,7 @@
     </w:p>
     <w:p>
       <w:pPr>
+        <w:spacing w:line="240" w:lineRule="auto"/>
         <w:jc w:val="center"/>
       </w:pPr>
       <w:r>
@@ -1150,7 +1152,7 @@
     </w:p>
     <w:p>
       <w:pPr>
-        <w:spacing w:after="240"/>
+        <w:spacing w:line="240" w:lineRule="auto" w:after="240"/>
         <w:jc w:val="both"/>
       </w:pPr>
       <w:r>
@@ -1171,6 +1173,7 @@
     </w:p>
     <w:p>
       <w:pPr>
+        <w:spacing w:line="240" w:lineRule="auto"/>
         <w:jc w:val="center"/>
       </w:pPr>
       <w:r>
@@ -1210,7 +1213,7 @@
     </w:p>
     <w:p>
       <w:pPr>
-        <w:spacing w:after="240"/>
+        <w:spacing w:line="240" w:lineRule="auto" w:after="240"/>
         <w:jc w:val="both"/>
       </w:pPr>
       <w:r>
@@ -1231,6 +1234,7 @@
     </w:p>
     <w:p>
       <w:pPr>
+        <w:spacing w:line="240" w:lineRule="auto"/>
         <w:jc w:val="center"/>
       </w:pPr>
       <w:r>
@@ -1270,7 +1274,7 @@
     </w:p>
     <w:p>
       <w:pPr>
-        <w:spacing w:after="240"/>
+        <w:spacing w:line="240" w:lineRule="auto" w:after="240"/>
         <w:jc w:val="both"/>
       </w:pPr>
       <w:r>
@@ -1283,6 +1287,7 @@
     </w:p>
     <w:p>
       <w:pPr>
+        <w:spacing w:line="240" w:lineRule="auto"/>
         <w:jc w:val="center"/>
       </w:pPr>
       <w:r>
@@ -1322,7 +1327,7 @@
     </w:p>
     <w:p>
       <w:pPr>
-        <w:spacing w:after="240"/>
+        <w:spacing w:line="240" w:lineRule="auto" w:after="240"/>
         <w:jc w:val="both"/>
       </w:pPr>
       <w:r>

</xml_diff>

<commit_message>
Regenerate artigo.docx with Figures 6-7 (secretome + effector candidates)
Adds real captions for the two new figures produced this session
(secretome_summary, effector_candidates) to gerar_artigo_docx.py's
FIGURE_CAPTIONS map, then regenerates artigo.docx from the updated
artigo.md. Verified by opening the .docx via Word COM automation and
exporting to PDF -- all 7 figures render without the known line-spacing
clipping bug (see feedback_docx_image_line_spacing).

Co-Authored-By: Claude Sonnet 5 <noreply@anthropic.com>
</commit_message>
<xml_diff>
--- a/artigo.docx
+++ b/artigo.docx
@@ -63,7 +63,7 @@
           <w:i/>
           <w:sz w:val="20"/>
         </w:rPr>
-        <w:t xml:space="preserve"> este documento é atualizado incrementalmente à medida que os módulos de análise avançam (ver [Seção 6 — Status das Análises](#6-status-das-análises--próximas-etapas) para o estado atual). Última atualização: 2026-07-02.</w:t>
+        <w:t xml:space="preserve"> este documento é atualizado incrementalmente à medida que os módulos de análise avançam (ver [Seção 6 — Status das Análises](#6-status-das-análises--próximas-etapas) para o estado atual). Última atualização: 2026-07-23.</w:t>
       </w:r>
     </w:p>
     <w:p>
@@ -115,7 +115,7 @@
         <w:t>M. spectabilis</w:t>
       </w:r>
       <w:r>
-        <w:t xml:space="preserve"> (Trinity: 90.344 genes / 103.560 transcritos; CD-HIT-EST 95%; TransDecoder: 12.445 proteínas; BUSCO insecta_odb10: C:96,2%), e iniciamos uma investigação transcriptômica dirigida a duas hipóteses complementares sobre a origem do amarelão: (i) toxinas/efetores salivares fitotóxicos secretados durante a alimentação xilemática, e (ii) contribuição de microrganismos associados à glândula/hospedeiro. A triagem taxonômica das anotações já revelou </w:t>
+        <w:t xml:space="preserve"> (Trinity: 90.344 genes / 103.560 transcritos; CD-HIT-EST 95%; TransDecoder: 12.445 proteínas; BUSCO insecta_odb10: C:96,2%), e iniciamos uma investigação transcriptômica dirigida a duas hipóteses complementares sobre a origem do amarelão: (i) toxinas/efetores salivares fitotóxicos secretados durante a alimentação xilemática, e (ii) contribuição de microrganismos associados à glândula/hospedeiro. A triagem taxonômica das anotações revelou </w:t>
       </w:r>
       <w:r>
         <w:rPr>
@@ -127,10 +127,22 @@
         <w:rPr>
           <w:i/>
         </w:rPr>
-        <w:t xml:space="preserve">, consistente com o padrão de endossimbiose dupla obrigatória descrito para cigarrinhas-das-pastagens sul-americanas próximas. A anotação funcional já identifica múltiplos candidatos plausíveis a efetor salivar (proteases tipo veneno, peptídeos salivares secretados, mucinas, fosfolipases, domínios EF-hand/Ca-binding, lacase), cuja priorização sistemática (predição de secretoma + expressão + cruzamento com literatura proteômica do mesmo grupo) está em andamento. Este trabalho fornece o primeiro recurso transcriptômico de larga escala para a glândula salivar de </w:t>
-      </w:r>
-      <w:r>
-        <w:t>M. spectabilis* e um arcabouço analítico replicável para testar hipóteses sobre fitotoxemia e simbiose em Cercopidae.</w:t>
+        <w:t xml:space="preserve">, consistente com o padrão de endossimbiose dupla obrigatória descrito para cigarrinhas-das-pastagens sul-americanas próximas; uma segunda camada de classificação estrutural independente (Whokaryote+Tiara) confirmou 3 desses candidatos como procariotos (0 discordâncias), com os demais fora do alcance de avaliação da ferramenta. A predição de secretoma clássico (TMbed) identificou 1.171 proteínas secretadas (9,4%), das quais </w:t>
+      </w:r>
+      <w:r>
+        <w:rPr>
+          <w:i/>
+        </w:rPr>
+        <w:t>35 são candidatos priorizados a efetor/toxina salivar</w:t>
+      </w:r>
+      <w:r>
+        <w:rPr>
+          <w:i/>
+        </w:rPr>
+        <w:t xml:space="preserve"> por combinarem secreção com termos/domínios associados a fitotoxicidade em outros Hemiptera (proteases e carboxipeptidases tipo veneno, peptídeos salivares secretados, mucinas, fosfolipases, domínios EF-hand/Ca-binding, lacase). Uma anotação dbCAN dedicada, mais sensível que a anotação CAZy padrão, identificou adicionalmente 16 proteínas com domínios GH28/GH5 (celulases/pectinases), embora nenhuma esteja no secretoma clássico. Este trabalho fornece o primeiro recurso transcriptômico de larga escala para a glândula salivar de </w:t>
+      </w:r>
+      <w:r>
+        <w:t>M. spectabilis* e um arcabouço analítico replicável, com uma lista concreta e priorizada de candidatos, para testar hipóteses sobre fitotoxemia e simbiose em Cercopidae.</w:t>
       </w:r>
     </w:p>
     <w:p>
@@ -608,7 +620,16 @@
         <w:jc w:val="both"/>
       </w:pPr>
       <w:r>
-        <w:t>Proteínas preditas foram/serão submetidas a predição de peptídeo sinal (SignalP 6.0, com fallback para 5.0) e contagem de hélices transmembrana (TMHMM), classificando como "secretoma clássico" as proteínas com peptídeo sinal presente E ≤1 hélice TM (</w:t>
+        <w:t xml:space="preserve">Proteínas preditas foram submetidas a predição conjunta de peptídeo sinal e segmento transmembrana com </w:t>
+      </w:r>
+      <w:r>
+        <w:rPr>
+          <w:b/>
+        </w:rPr>
+        <w:t>TMbed</w:t>
+      </w:r>
+      <w:r>
+        <w:t xml:space="preserve"> (Bernhofer &amp; Rost, 2022), um preditor baseado em embeddings de protein language model (ProtT5), classificando como "secretoma clássico" as proteínas com peptídeo sinal presente E ≤1 segmento transmembrana (</w:t>
       </w:r>
       <w:r>
         <w:rPr>
@@ -618,16 +639,43 @@
         <w:t>05_secretome/secretome_predict.py</w:t>
       </w:r>
       <w:r>
-        <w:t xml:space="preserve">, 9 fases). </w:t>
+        <w:t>). TMbed substituiu SignalP6/TMHMM, cuja licença acadêmica DTU nunca foi obtida neste ou em outros dois projetos do laboratório (</w:t>
+      </w:r>
+      <w:r>
+        <w:rPr>
+          <w:rFonts w:ascii="Courier New" w:hAnsi="Courier New"/>
+          <w:sz w:val="20"/>
+        </w:rPr>
+        <w:t>RLPredictiOme</w:t>
+      </w:r>
+      <w:r>
+        <w:t xml:space="preserve">, </w:t>
+      </w:r>
+      <w:r>
+        <w:rPr>
+          <w:rFonts w:ascii="Courier New" w:hAnsi="Courier New"/>
+          <w:sz w:val="20"/>
+        </w:rPr>
+        <w:t>caracterization-trypsin</w:t>
+      </w:r>
+      <w:r>
+        <w:t xml:space="preserve">); TMbed é instalável via </w:t>
+      </w:r>
+      <w:r>
+        <w:rPr>
+          <w:rFonts w:ascii="Courier New" w:hAnsi="Courier New"/>
+          <w:sz w:val="20"/>
+        </w:rPr>
+        <w:t>pip</w:t>
+      </w:r>
+      <w:r>
+        <w:t xml:space="preserve">, roda localmente sem necessidade de conta/licença, e não está disponível via bioconda/conda-forge sob nenhum nome de pacote. </w:t>
       </w:r>
       <w:r>
         <w:rPr>
           <w:b/>
         </w:rPr>
-        <w:t>Status: implementado, execução pendente</w:t>
-      </w:r>
-      <w:r>
-        <w:t xml:space="preserve"> (depende de instalação de SignalP6/TMHMM em servidor com licença acadêmica — ver Seção 6).</w:t>
+        <w:t>Status: concluído.</w:t>
       </w:r>
     </w:p>
     <w:p>
@@ -643,26 +691,23 @@
         <w:jc w:val="both"/>
       </w:pPr>
       <w:r>
-        <w:t xml:space="preserve">Uma vez disponível o secretoma clássico, os candidatos serão filtrados por: (i) status de secretado; (ii) presença de termos/domínios funcionais associados a fitotoxicidade em Hemiptera na literatura (proteases tipo veneno, peptídeos salivares secretados, mucinas, lacases, fosfolipases A2/B, domínios EF-hand/Ca-binding, CAZymes GH28/GH5 via dbCAN dedicado); e (iii) nível de expressão (TPM). Peso adicional será atribuído a candidatos que se sobrepõem a famílias/proteínas já reportadas na proteômica do mesmo grupo (Monteiro, 2019; Rinaldi, 2021, 2026). </w:t>
-      </w:r>
-      <w:r>
-        <w:rPr>
-          <w:b/>
-        </w:rPr>
-        <w:t>Status: planejado, aguardando secretoma</w:t>
-      </w:r>
-      <w:r>
-        <w:t xml:space="preserve"> (</w:t>
+        <w:t xml:space="preserve">Os candidatos foram filtrados por: (i) status de secretado (Seção 2.5); (ii) presença de termos/domínios funcionais associados a fitotoxicidade em Hemiptera na literatura (proteases tipo veneno, peptídeos salivares secretados, mucinas, lacases, fosfolipases A2/B, domínios EF-hand/Ca-binding, CAZymes GH28/GH5 via dbCAN dedicado); e (iii) nível de expressão (TPM), via </w:t>
       </w:r>
       <w:r>
         <w:rPr>
           <w:rFonts w:ascii="Courier New" w:hAnsi="Courier New"/>
           <w:sz w:val="20"/>
         </w:rPr>
-        <w:t>06_effector_prioritization/</w:t>
-      </w:r>
-      <w:r>
-        <w:t>).</w:t>
+        <w:t>06_effector_prioritization/effector_candidates.py</w:t>
+      </w:r>
+      <w:r>
+        <w:t xml:space="preserve">. O ranking é aditivo (número de termos curados correspondentes, depois TPM), não inferido por ML. </w:t>
+      </w:r>
+      <w:r>
+        <w:rPr>
+          <w:b/>
+        </w:rPr>
+        <w:t>Status: concluído.</w:t>
       </w:r>
     </w:p>
     <w:p>
@@ -687,7 +732,7 @@
         <w:t>Camada 1</w:t>
       </w:r>
       <w:r>
-        <w:t xml:space="preserve"> (implementada) — reaproveitamento das classificações taxonômicas DIAMOND/lineage já geradas na anotação funcional (</w:t>
+        <w:t xml:space="preserve"> — reaproveitamento das classificações taxonômicas DIAMOND/lineage já geradas na anotação funcional (</w:t>
       </w:r>
       <w:r>
         <w:rPr>
@@ -742,7 +787,78 @@
         <w:t>Camada 2</w:t>
       </w:r>
       <w:r>
-        <w:t xml:space="preserve"> (planejada, servidor) — confirmação independente via classificação de contigs montados por estrutura gênica (Whokaryote/Tiara) e/ou LCA taxonômico (CAT/BAT), robusta para organismos pouco representados em bancos de referência.</w:t>
+        <w:t xml:space="preserve"> — confirmação independente via classificação estrutural (baseada em conteúdo gênico, não em similaridade de sequência a um banco de referência — portanto não circular em relação à Camada 1) dos contigs montados com Whokaryote+Tiara (Pronk &amp; Medema, 2022; Karlicki et al., 2022), cruzada com a Camada 1 via </w:t>
+      </w:r>
+      <w:r>
+        <w:rPr>
+          <w:rFonts w:ascii="Courier New" w:hAnsi="Courier New"/>
+          <w:sz w:val="20"/>
+        </w:rPr>
+        <w:t>07_metagenomic_screen/04_cross_validate_endosymbionts.py</w:t>
+      </w:r>
+      <w:r>
+        <w:t xml:space="preserve">. </w:t>
+      </w:r>
+      <w:r>
+        <w:rPr>
+          <w:b/>
+        </w:rPr>
+        <w:t>Status: concluído</w:t>
+      </w:r>
+      <w:r>
+        <w:t xml:space="preserve"> (ambas as camadas).</w:t>
+      </w:r>
+    </w:p>
+    <w:p>
+      <w:pPr>
+        <w:pStyle w:val="Heading3"/>
+      </w:pPr>
+      <w:r>
+        <w:t>2.8 Anotação CAZy dedicada</w:t>
+      </w:r>
+    </w:p>
+    <w:p>
+      <w:pPr>
+        <w:jc w:val="both"/>
+      </w:pPr>
+      <w:r>
+        <w:t xml:space="preserve">A anotação CAZy do eggNOG-mapper (Seção 2.3) cobre apenas 1,4% das proteínas e não identificou nenhum hit às famílias GH28/GH5 — resultado de baixa sensibilidade conhecida, não necessariamente ausência real dessas atividades. Uma anotação dbCAN dedicada foi executada com </w:t>
+      </w:r>
+      <w:r>
+        <w:rPr>
+          <w:rFonts w:ascii="Courier New" w:hAnsi="Courier New"/>
+          <w:sz w:val="20"/>
+        </w:rPr>
+        <w:t>run_dbcan</w:t>
+      </w:r>
+      <w:r>
+        <w:t xml:space="preserve"> (DIAMOND + dbCAN-HMM + dbCAN-sub contra o banco de dados dbCAN real; Zheng et al., 2023), via </w:t>
+      </w:r>
+      <w:r>
+        <w:rPr>
+          <w:rFonts w:ascii="Courier New" w:hAnsi="Courier New"/>
+          <w:sz w:val="20"/>
+        </w:rPr>
+        <w:t>03_annotation/08_cazy_annotation.sh</w:t>
+      </w:r>
+      <w:r>
+        <w:t xml:space="preserve"> + </w:t>
+      </w:r>
+      <w:r>
+        <w:rPr>
+          <w:rFonts w:ascii="Courier New" w:hAnsi="Courier New"/>
+          <w:sz w:val="20"/>
+        </w:rPr>
+        <w:t>09_merge_cazy.py</w:t>
+      </w:r>
+      <w:r>
+        <w:t xml:space="preserve">. </w:t>
+      </w:r>
+      <w:r>
+        <w:rPr>
+          <w:b/>
+        </w:rPr>
+        <w:t>Status: concluído.</w:t>
       </w:r>
     </w:p>
     <w:p>
@@ -1098,16 +1214,25 @@
         <w:t>results/annotation_complete.tsv</w:t>
       </w:r>
       <w:r>
-        <w:t xml:space="preserve">, 12.445 proteínas), 62,1% possuem domínio Pfam, 44,0% possuem termo GO e 42,6% possuem ortólogo KEGG (eggNOG-mapper). Uma coluna CAZy foi adicionada (1,4% das proteínas, 175 no total), mas </w:t>
+        <w:t xml:space="preserve">, 12.445 proteínas), 62,1% possuem domínio Pfam, 44,0% possuem termo GO e 42,6% possuem ortólogo KEGG (eggNOG-mapper). A coluna CAZy do eggNOG cobria apenas 1,4% das proteínas (175) e não encontrou nenhum hit às famílias GH28/GH5. A anotação dbCAN dedicada (Seção 2.8) elevou a cobertura para </w:t>
       </w:r>
       <w:r>
         <w:rPr>
           <w:b/>
         </w:rPr>
-        <w:t>nenhum hit às famílias GH28/GH5</w:t>
-      </w:r>
-      <w:r>
-        <w:t xml:space="preserve"> (celulases/pectinases classicamente associadas a efetores fitotóxicos de degradação de parede celular) foi encontrado, resultado que reflete a baixa sensibilidade já conhecida da anotação CAZy do eggNOG e motiva uma análise dbCAN dedicada (Seção 2.6).</w:t>
+        <w:t>468 proteínas (3,8%) com pelo menos uma família CAZy</w:t>
+      </w:r>
+      <w:r>
+        <w:t xml:space="preserve"> e identificou </w:t>
+      </w:r>
+      <w:r>
+        <w:rPr>
+          <w:b/>
+        </w:rPr>
+        <w:t>16 proteínas com chamada GH28 ou GH5\</w:t>
+      </w:r>
+      <w:r>
+        <w:t>* (celulases/pectinases classicamente associadas a efetores fitotóxicos de degradação de parede celular) — resultado que confirma a baixa sensibilidade da anotação CAZy do eggNOG e fornece novos candidatos reais para a Seção 3.6.</w:t>
       </w:r>
     </w:p>
     <w:p>
@@ -1731,10 +1856,61 @@
     </w:p>
     <w:p>
       <w:pPr>
+        <w:jc w:val="both"/>
+      </w:pPr>
+      <w:r>
+        <w:rPr>
+          <w:b/>
+        </w:rPr>
+        <w:t>Confirmação independente (Camada 2):</w:t>
+      </w:r>
+      <w:r>
+        <w:t xml:space="preserve"> a classificação estrutural eucarioto/procarioto de Whokaryote+Tiara, que não depende de similaridade de sequência a um banco de referência, foi cruzada com os 60 candidatos da Camada 1 (57 </w:t>
+      </w:r>
+      <w:r>
+        <w:rPr>
+          <w:i/>
+        </w:rPr>
+        <w:t>Sulcia</w:t>
+      </w:r>
+      <w:r>
+        <w:t>/</w:t>
+      </w:r>
+      <w:r>
+        <w:rPr>
+          <w:i/>
+        </w:rPr>
+        <w:t>Sodalis</w:t>
+      </w:r>
+      <w:r>
+        <w:t>-like + 2 patógenos de baixa prioridade). Whokaryote só classifica contigs ≥5.000 pb — a maioria dos candidatos é composta por genes bacterianos únicos em transcritos Trinity curtos — de modo que apenas 3 candidatos puderam ser avaliados; os 3 foram classificados como procarioto (</w:t>
+      </w:r>
+      <w:r>
+        <w:rPr>
+          <w:b/>
+        </w:rPr>
+        <w:t>concordantes</w:t>
+      </w:r>
+      <w:r>
+        <w:t>, 0 discordantes), e os 57 restantes ficaram como "não analisado" por limitação de cobertura da Camada 2, não como evidência contra a chamada da Camada 1 (</w:t>
+      </w:r>
+      <w:r>
+        <w:rPr>
+          <w:rFonts w:ascii="Courier New" w:hAnsi="Courier New"/>
+          <w:sz w:val="20"/>
+        </w:rPr>
+        <w:t>results/endosymbiont_candidates/endosymbionts_cross_validated.tsv</w:t>
+      </w:r>
+      <w:r>
+        <w:t>).</w:t>
+      </w:r>
+    </w:p>
+    <w:p>
+      <w:pPr>
         <w:pStyle w:val="Heading3"/>
       </w:pPr>
       <w:r>
-        <w:t>3.5 Candidatos preliminares a efetor/toxina salivar (pré-secretoma)</w:t>
+        <w:t>3.5 Predição de secretoma clássico</w:t>
       </w:r>
     </w:p>
     <w:p>
@@ -1742,7 +1918,194 @@
         <w:jc w:val="both"/>
       </w:pPr>
       <w:r>
-        <w:t>Mesmo antes da filtragem formal por secretoma (Seção 2.6), a anotação funcional já revela múltiplas famílias de interesse compatíveis com efetores salivares fitotóxicos descritos em outros Hemiptera: proteases tipo veneno (protease-like, dipeptidil peptidase 4, carboxipeptidase de serina, 5′-nucleotidase tipo veneno de serpente), peptídeos/proteínas salivares secretados (domínio MBF2), óxido nítrico sintase salivar, lacase 1, mucinas (mucin-2/5AC/7/17, hemocitina), fosfolipases A2/B, e 78 domínios EF-hand (ligação a Ca²⁺). A ausência de anotação CAZy sensível (Seção 3.2) deixa em aberto a questão de celulases/pectinases, a ser resolvida com dbCAN dedicado. A priorização quantitativa (peso por secreção, expressão e literatura) está pendente (Seção 2.6).</w:t>
+        <w:t xml:space="preserve">A predição TMbed (Seção 2.5) classificou </w:t>
+      </w:r>
+      <w:r>
+        <w:rPr>
+          <w:b/>
+        </w:rPr>
+        <w:t>1.238 proteínas (9,9%) com peptídeo sinal</w:t>
+      </w:r>
+      <w:r>
+        <w:t xml:space="preserve"> e </w:t>
+      </w:r>
+      <w:r>
+        <w:rPr>
+          <w:b/>
+        </w:rPr>
+        <w:t>1.171 proteínas (9,4%) como secretoma clássico</w:t>
+      </w:r>
+      <w:r>
+        <w:t xml:space="preserve"> (peptídeo sinal presente E ≤1 segmento transmembrana; 67 proteínas excluídas por terem &gt;1 segmento TM). Do secretoma clássico, 79,0% têm hit DIAMOND, 67,1% têm domínio Pfam, 51,0% têm termo GO e 37,7% têm ortólogo KEGG. As categorias COG mais representadas no secretoma clássico são função desconhecida (277), transdução de sinal (147), modificação pós-traducional/chaperonas (145) e transporte/metabolismo de carboidratos (89) (</w:t>
+      </w:r>
+      <w:r>
+        <w:rPr>
+          <w:rFonts w:ascii="Courier New" w:hAnsi="Courier New"/>
+          <w:sz w:val="20"/>
+        </w:rPr>
+        <w:t>results/secretome/secretome_report.txt</w:t>
+      </w:r>
+      <w:r>
+        <w:t>).</w:t>
+      </w:r>
+    </w:p>
+    <w:p>
+      <w:pPr>
+        <w:spacing w:line="240" w:lineRule="auto"/>
+        <w:jc w:val="center"/>
+      </w:pPr>
+      <w:r>
+        <w:drawing>
+          <wp:inline xmlns:a="http://schemas.openxmlformats.org/drawingml/2006/main" xmlns:pic="http://schemas.openxmlformats.org/drawingml/2006/picture">
+            <wp:extent cx="5760720" cy="2211353"/>
+            <wp:docPr id="6" name="Picture 6"/>
+            <wp:cNvGraphicFramePr>
+              <a:graphicFrameLocks noChangeAspect="1"/>
+            </wp:cNvGraphicFramePr>
+            <a:graphic>
+              <a:graphicData uri="http://schemas.openxmlformats.org/drawingml/2006/picture">
+                <pic:pic>
+                  <pic:nvPicPr>
+                    <pic:cNvPr id="0" name="secretome_summary.png"/>
+                    <pic:cNvPicPr/>
+                  </pic:nvPicPr>
+                  <pic:blipFill>
+                    <a:blip r:embed="rId14"/>
+                    <a:stretch>
+                      <a:fillRect/>
+                    </a:stretch>
+                  </pic:blipFill>
+                  <pic:spPr>
+                    <a:xfrm>
+                      <a:off x="0" y="0"/>
+                      <a:ext cx="5760720" cy="2211353"/>
+                    </a:xfrm>
+                    <a:prstGeom prst="rect"/>
+                  </pic:spPr>
+                </pic:pic>
+              </a:graphicData>
+            </a:graphic>
+          </wp:inline>
+        </w:drawing>
+      </w:r>
+    </w:p>
+    <w:p>
+      <w:pPr>
+        <w:spacing w:line="240" w:lineRule="auto" w:after="240"/>
+        <w:jc w:val="both"/>
+      </w:pPr>
+      <w:r>
+        <w:rPr>
+          <w:i/>
+          <w:sz w:val="18"/>
+        </w:rPr>
+        <w:t>Figura 6. Predicao do secretoma classico com TMbed (substitui SignalP/TMHMM, indisponiveis sem licenca DTU). (A) Funil de predicao: das 12.445 proteinas, 1.238 (9,9%) tem peptideo sinal, das quais 1.171 (9,4%) compoem o secretoma classico (&lt;=1 segmento transmembrana) e 67 foram excluidas por terem mais de 1 segmento TM. (B) Distribuicao do numero de segmentos transmembrana preditos entre as proteinas com peptideo sinal, separando secretoma classico e excluidas, com linha de corte em TM=1. (C) Categorias COG mais frequentes entre as 1.171 proteinas do secretoma classico: [S] funcao desconhecida (277), [T] transducao de sinal (147), [O] modificacao pos-traducional/chaperonas (145) e [G] transporte/metabolismo de carboidratos (89).</w:t>
+      </w:r>
+    </w:p>
+    <w:p>
+      <w:pPr>
+        <w:pStyle w:val="Heading3"/>
+      </w:pPr>
+      <w:r>
+        <w:t>3.6 Candidatos a efetor/toxina salivar (secretoma × termos curados × expressão)</w:t>
+      </w:r>
+    </w:p>
+    <w:p>
+      <w:pPr>
+        <w:jc w:val="both"/>
+      </w:pPr>
+      <w:r>
+        <w:t xml:space="preserve">A interseção do secretoma clássico com a lista curada de termos/domínios de efetor/toxina (Seção 2.6) produziu </w:t>
+      </w:r>
+      <w:r>
+        <w:rPr>
+          <w:b/>
+        </w:rPr>
+        <w:t>35 candidatos</w:t>
+      </w:r>
+      <w:r>
+        <w:t xml:space="preserve"> (</w:t>
+      </w:r>
+      <w:r>
+        <w:rPr>
+          <w:rFonts w:ascii="Courier New" w:hAnsi="Courier New"/>
+          <w:sz w:val="20"/>
+        </w:rPr>
+        <w:t>results/effector_candidates/effector_candidates_ranked.tsv</w:t>
+      </w:r>
+      <w:r>
+        <w:t xml:space="preserve">). Por categoria: domínios EF-hand/Ca-binding (16), mucinas (9), peptídeo/proteína salivar secretado (4), fosfolipase A2/B (2), protease tipo veneno (1), carboxipeptidase tipo veneno (1), dipeptidil peptidase 4 tipo veneno (1) e lacase (1). Os candidatos de maior expressão incluem uma proteína salivar secretada (melhor hit DIAMOND: </w:t>
+      </w:r>
+      <w:r>
+        <w:rPr>
+          <w:i/>
+        </w:rPr>
+        <w:t>Triatoma infestans</w:t>
+      </w:r>
+      <w:r>
+        <w:t xml:space="preserve">, TPM=52,3), uma protease tipo veneno (melhor hit: </w:t>
+      </w:r>
+      <w:r>
+        <w:rPr>
+          <w:i/>
+        </w:rPr>
+        <w:t>Macrosteles quadrilineatus</w:t>
+      </w:r>
+      <w:r>
+        <w:t>, cigarrinha da mesma ordem Hemiptera, TPM=6,9) e uma carboxipeptidase de serina tipo veneno. Nenhum dos 16 hits GH28/GH5 do dbCAN dedicado (Seção 3.2) permaneceu na lista final por não estarem simultaneamente no secretoma clássico — achado que qualifica, sem invalidar, a hipótese de celulases/pectinases secretadas como efetores.</w:t>
+      </w:r>
+    </w:p>
+    <w:p>
+      <w:pPr>
+        <w:spacing w:line="240" w:lineRule="auto"/>
+        <w:jc w:val="center"/>
+      </w:pPr>
+      <w:r>
+        <w:drawing>
+          <wp:inline xmlns:a="http://schemas.openxmlformats.org/drawingml/2006/main" xmlns:pic="http://schemas.openxmlformats.org/drawingml/2006/picture">
+            <wp:extent cx="5760720" cy="6235132"/>
+            <wp:docPr id="7" name="Picture 7"/>
+            <wp:cNvGraphicFramePr>
+              <a:graphicFrameLocks noChangeAspect="1"/>
+            </wp:cNvGraphicFramePr>
+            <a:graphic>
+              <a:graphicData uri="http://schemas.openxmlformats.org/drawingml/2006/picture">
+                <pic:pic>
+                  <pic:nvPicPr>
+                    <pic:cNvPr id="0" name="effector_candidates.png"/>
+                    <pic:cNvPicPr/>
+                  </pic:nvPicPr>
+                  <pic:blipFill>
+                    <a:blip r:embed="rId15"/>
+                    <a:stretch>
+                      <a:fillRect/>
+                    </a:stretch>
+                  </pic:blipFill>
+                  <pic:spPr>
+                    <a:xfrm>
+                      <a:off x="0" y="0"/>
+                      <a:ext cx="5760720" cy="6235132"/>
+                    </a:xfrm>
+                    <a:prstGeom prst="rect"/>
+                  </pic:spPr>
+                </pic:pic>
+              </a:graphicData>
+            </a:graphic>
+          </wp:inline>
+        </w:drawing>
+      </w:r>
+    </w:p>
+    <w:p>
+      <w:pPr>
+        <w:spacing w:line="240" w:lineRule="auto" w:after="240"/>
+        <w:jc w:val="both"/>
+      </w:pPr>
+      <w:r>
+        <w:rPr>
+          <w:i/>
+          <w:sz w:val="18"/>
+        </w:rPr>
+        <w:t>Figura 7. Candidatos priorizados a efetor/toxina salivar (n=35), ranqueados por numero de termos curados correspondentes e por TPM (cor/tamanho do ponto). Criterio: proteina simultaneamente no secretoma classico (Figura 6) E com correspondencia a pelo menos um termo/dominio associado a fitotoxicidade em outros Hemiptera (dominios EF-hand/Ca-binding: 16; mucina: 9; peptideo/proteina salivar secretado: 4; fosfolipase A2/B: 2; protease, carboxipeptidase e dipeptidil peptidase 4 tipo veneno: 1 cada; lacase: 1). Os candidatos mais expressos incluem uma proteina salivar secretada (melhor hit DIAMOND: Triatoma infestans) e uma protease tipo veneno (melhor hit: Macrosteles quadrilineatus).</w:t>
       </w:r>
     </w:p>
     <w:p>
@@ -1823,7 +2186,7 @@
         <w:t>M. spectabilis</w:t>
       </w:r>
       <w:r>
-        <w:t xml:space="preserve"> é mecanisticamente compatível, esta permanece uma hipótese em aberto que merece confirmação direcionada (PCR específico, por exemplo), não descartável apenas pela ausência de sinal transcriptômico forte em uma única biblioteca.</w:t>
+        <w:t xml:space="preserve"> é mecanisticamente compatível, esta permanece uma hipótese em aberto que merece confirmação direcionada (PCR específico, por exemplo), não descartável apenas pela ausência de sinal transcriptômico forte em uma única biblioteca. A confirmação independente por Whokaryote+Tiara (Seção 3.4) reforça a robustez da chamada de endossimbionte nos 3 candidatos com cobertura suficiente para avaliação, mas a limitação de tamanho mínimo de contig (≥5.000 pb) impede o mesmo teste para a maioria dos hits — uma segunda evidência independente ainda seria valiosa (ex. PCR/16S dirigido).</w:t>
       </w:r>
     </w:p>
     <w:p>
@@ -1831,7 +2194,25 @@
         <w:jc w:val="both"/>
       </w:pPr>
       <w:r>
-        <w:t>Quanto à hipótese de toxina/efetor salivar, a anotação já disponível aponta para diversos candidatos promissores, mas a conclusão substantiva sobre quais desses transcritos são efetivamente secretados, abundantes e específicos da glândula salivar depende da execução do módulo de secretoma e da priorização quantitativa (Seção 2.5–2.6), ainda pendentes. A convergência entre esta abordagem transcriptômica e a proteômica já publicada/em andamento pelo grupo UFV (Monteiro, 2019; Rinaldi, 2021, 2026) será um teste importante de robustez para qualquer candidato priorizado.</w:t>
+        <w:t xml:space="preserve">Quanto à hipótese de toxina/efetor salivar, a execução completa do secretoma (TMbed) e da priorização (Seções 2.5–2.6) reduziu o conjunto de candidatos plausíveis de dezenas de famílias anotadas para </w:t>
+      </w:r>
+      <w:r>
+        <w:rPr>
+          <w:b/>
+        </w:rPr>
+        <w:t>35 proteínas</w:t>
+      </w:r>
+      <w:r>
+        <w:t xml:space="preserve"> que são simultaneamente secretadas e portadoras de um termo/domínio associado a fitotoxicidade em outros Hemiptera — incluindo uma proteína salivar secretada de alta expressão, uma protease tipo veneno com melhor hit em outra cigarrinha (</w:t>
+      </w:r>
+      <w:r>
+        <w:rPr>
+          <w:i/>
+        </w:rPr>
+        <w:t>Macrosteles quadrilineatus</w:t>
+      </w:r>
+      <w:r>
+        <w:t>), e uma carboxipeptidase de serina tipo veneno. A anotação dbCAN dedicada (Seção 2.8) encontrou pela primeira vez hits GH28/GH5 (16 proteínas) que a anotação eggNOG original não detectava, mas nenhum desses hits está no secretoma clássico — o que não descarta a hipótese de degradação de parede celular como mecanismo de fitotoxemia, mas indica que, se real, ela não opera pela via clássica de secreção Sec/SPI capturada pelo TMbed (ex. secreção não-clássica, ou celulases/pectinases intracelulares/estruturais). A convergência entre esta lista priorizada e a proteômica já publicada/em andamento pelo grupo UFV (Monteiro, 2019; Rinaldi, 2021, 2026) permanece o teste de robustez mais importante a ser feito, agora com uma lista concreta e finita de candidatos em vez de uma anotação funcional bruta.</w:t>
       </w:r>
     </w:p>
     <w:p>
@@ -1860,7 +2241,7 @@
         <w:spacing w:after="60"/>
       </w:pPr>
       <w:r>
-        <w:t>Cobertura de anotação por eggNOG/KEGG (~43-44%) e a ausência de hits CAZy GH28/GH5 podem refletir tanto ausência real dessas atividades enzimáticas quanto limitações de sensibilidade das ferramentas usadas; as duas explicações não são equivalentes.</w:t>
+        <w:t>Cobertura de anotação por eggNOG/KEGG (~43-44%) permanece parcial; mesmo com a anotação dbCAN dedicada (3,8% de cobertura CAZy, 16 hits GH28/GH5), a ausência de hits em proteínas específicas não distingue com certeza entre ausência real da atividade enzimática e limitação de sensibilidade das ferramentas.</w:t>
       </w:r>
     </w:p>
     <w:p>
@@ -1888,6 +2269,24 @@
       </w:r>
       <w:r>
         <w:t>/fitoplasma são de baixa confiança e não substituem confirmação molecular direcionada (PCR/sequenciamento de amplicon).</w:t>
+      </w:r>
+    </w:p>
+    <w:p>
+      <w:pPr>
+        <w:pStyle w:val="ListNumber"/>
+        <w:spacing w:after="60"/>
+      </w:pPr>
+      <w:r>
+        <w:t>A confirmação estrutural independente de endossimbiontes (Whokaryote+Tiara, Camada 2) só pôde ser aplicada a 3 dos 60 candidatos por causa do corte mínimo de 5.000 pb da ferramenta — a maioria dos genes bacterianos únicos ocorre em transcritos Trinity mais curtos que isso.</w:t>
+      </w:r>
+    </w:p>
+    <w:p>
+      <w:pPr>
+        <w:pStyle w:val="ListNumber"/>
+        <w:spacing w:after="60"/>
+      </w:pPr>
+      <w:r>
+        <w:t>A lista de 35 candidatos a efetor/toxina depende inteiramente da regra de secreção clássica (peptídeo sinal Sec/SPI + ≤1 segmento TM, via TMbed); vias de secreção não-clássicas (ex. exossomos, secreção não-canônica) não são capturadas por esse critério e podem excluir candidatos reais, incluindo os 16 hits GH28/GH5 do dbCAN dedicado.</w:t>
       </w:r>
     </w:p>
     <w:p>
@@ -1906,7 +2305,7 @@
         <w:jc w:val="both"/>
       </w:pPr>
       <w:r>
-        <w:t xml:space="preserve">Tabela viva, atualizada a cada módulo concluído (ver plano completo em </w:t>
+        <w:t xml:space="preserve">Tabela viva, atualizada a cada módulo concluído (plano original em </w:t>
       </w:r>
       <w:r>
         <w:rPr>
@@ -1914,6 +2313,16 @@
           <w:sz w:val="20"/>
         </w:rPr>
         <w:t>C:\Users\eulal\.claude\plans\fa-a-um-diagn-stico-desse-crystalline-noodle.md</w:t>
+      </w:r>
+      <w:r>
+        <w:t xml:space="preserve">; plano de execução desta rodada em </w:t>
+      </w:r>
+      <w:r>
+        <w:rPr>
+          <w:rFonts w:ascii="Courier New" w:hAnsi="Courier New"/>
+          <w:sz w:val="20"/>
+        </w:rPr>
+        <w:t>C:\Users\eulal\.claude\plans\iterative-discovering-seahorse.md</w:t>
       </w:r>
       <w:r>
         <w:t>):</w:t>
@@ -2166,7 +2575,7 @@
                 <w:rFonts w:ascii="Times New Roman" w:hAnsi="Times New Roman"/>
                 <w:sz w:val="20"/>
               </w:rPr>
-              <w:t>Usado nos módulos 5 e 6</w:t>
+              <w:t>Usado nos módulos 5-7</w:t>
             </w:r>
           </w:p>
         </w:tc>
@@ -2240,7 +2649,7 @@
                 <w:rFonts w:ascii="Times New Roman" w:hAnsi="Times New Roman"/>
                 <w:sz w:val="20"/>
               </w:rPr>
-              <w:t>5. Triagem de endossimbiontes — Camada 2 (Whokaryote/Tiara/CAT-BAT)</w:t>
+              <w:t>5. Triagem de endossimbiontes — Camada 2 (Whokaryote/Tiara)</w:t>
             </w:r>
           </w:p>
         </w:tc>
@@ -2254,7 +2663,7 @@
                 <w:rFonts w:ascii="Times New Roman" w:hAnsi="Times New Roman"/>
                 <w:sz w:val="20"/>
               </w:rPr>
-              <w:t>Pendente</w:t>
+              <w:t>Concluído</w:t>
             </w:r>
           </w:p>
         </w:tc>
@@ -2268,7 +2677,7 @@
                 <w:rFonts w:ascii="Times New Roman" w:hAnsi="Times New Roman"/>
                 <w:sz w:val="20"/>
               </w:rPr>
-              <w:t>—</w:t>
+              <w:t>2026-07-23</w:t>
             </w:r>
           </w:p>
         </w:tc>
@@ -2282,7 +2691,7 @@
                 <w:rFonts w:ascii="Times New Roman" w:hAnsi="Times New Roman"/>
                 <w:sz w:val="20"/>
               </w:rPr>
-              <w:t>Requer servidor; aguardando autorização</w:t>
+              <w:t>3 concordantes / 0 discordantes / 57 não avaliados (corte de 5.000 pb); Seção 3.4</w:t>
             </w:r>
           </w:p>
         </w:tc>
@@ -2298,7 +2707,7 @@
                 <w:rFonts w:ascii="Times New Roman" w:hAnsi="Times New Roman"/>
                 <w:sz w:val="20"/>
               </w:rPr>
-              <w:t>6. Predição de secretoma (SignalP6/TMHMM)</w:t>
+              <w:t>6. Predição de secretoma (TMbed, substitui SignalP6/TMHMM)</w:t>
             </w:r>
           </w:p>
         </w:tc>
@@ -2312,7 +2721,7 @@
                 <w:rFonts w:ascii="Times New Roman" w:hAnsi="Times New Roman"/>
                 <w:sz w:val="20"/>
               </w:rPr>
-              <w:t>Pendente</w:t>
+              <w:t>Concluído</w:t>
             </w:r>
           </w:p>
         </w:tc>
@@ -2326,7 +2735,7 @@
                 <w:rFonts w:ascii="Times New Roman" w:hAnsi="Times New Roman"/>
                 <w:sz w:val="20"/>
               </w:rPr>
-              <w:t>—</w:t>
+              <w:t>2026-07-23</w:t>
             </w:r>
           </w:p>
         </w:tc>
@@ -2340,7 +2749,7 @@
                 <w:rFonts w:ascii="Times New Roman" w:hAnsi="Times New Roman"/>
                 <w:sz w:val="20"/>
               </w:rPr>
-              <w:t>Requer servidor + licença SignalP6; script pronto (`05_secretome/secretome_predict.py`)</w:t>
+              <w:t>1.171 proteínas (9,4%) no secretoma clássico; Seção 3.5</w:t>
             </w:r>
           </w:p>
         </w:tc>
@@ -2370,7 +2779,7 @@
                 <w:rFonts w:ascii="Times New Roman" w:hAnsi="Times New Roman"/>
                 <w:sz w:val="20"/>
               </w:rPr>
-              <w:t>Pendente</w:t>
+              <w:t>Concluído</w:t>
             </w:r>
           </w:p>
         </w:tc>
@@ -2384,7 +2793,7 @@
                 <w:rFonts w:ascii="Times New Roman" w:hAnsi="Times New Roman"/>
                 <w:sz w:val="20"/>
               </w:rPr>
-              <w:t>—</w:t>
+              <w:t>2026-07-23</w:t>
             </w:r>
           </w:p>
         </w:tc>
@@ -2398,7 +2807,7 @@
                 <w:rFonts w:ascii="Times New Roman" w:hAnsi="Times New Roman"/>
                 <w:sz w:val="20"/>
               </w:rPr>
-              <w:t>Depende do módulo 6; script a implementar (`06_effector_prioritization/`)</w:t>
+              <w:t>35 candidatos; Seção 3.6</w:t>
             </w:r>
           </w:p>
         </w:tc>
@@ -2428,7 +2837,7 @@
                 <w:rFonts w:ascii="Times New Roman" w:hAnsi="Times New Roman"/>
                 <w:sz w:val="20"/>
               </w:rPr>
-              <w:t>Pendente (opcional)</w:t>
+              <w:t>Concluído</w:t>
             </w:r>
           </w:p>
         </w:tc>
@@ -2442,7 +2851,7 @@
                 <w:rFonts w:ascii="Times New Roman" w:hAnsi="Times New Roman"/>
                 <w:sz w:val="20"/>
               </w:rPr>
-              <w:t>—</w:t>
+              <w:t>2026-07-23</w:t>
             </w:r>
           </w:p>
         </w:tc>
@@ -2456,7 +2865,7 @@
                 <w:rFonts w:ascii="Times New Roman" w:hAnsi="Times New Roman"/>
                 <w:sz w:val="20"/>
               </w:rPr>
-              <w:t>Requer servidor</w:t>
+              <w:t>468 proteínas com chamada CAZy, 16 GH28/GH5; Seção 3.2</w:t>
             </w:r>
           </w:p>
         </w:tc>
@@ -2519,6 +2928,64 @@
           </w:p>
         </w:tc>
       </w:tr>
+      <w:tr>
+        <w:tc>
+          <w:tcPr>
+            <w:tcW w:type="dxa" w:w="2280"/>
+          </w:tcPr>
+          <w:p>
+            <w:r>
+              <w:rPr>
+                <w:rFonts w:ascii="Times New Roman" w:hAnsi="Times New Roman"/>
+                <w:sz w:val="20"/>
+              </w:rPr>
+              <w:t>10. Validação experimental dos 35 candidatos a efetor (proteômica/RNAi/ensaio de fitotoxicidade)</w:t>
+            </w:r>
+          </w:p>
+        </w:tc>
+        <w:tc>
+          <w:tcPr>
+            <w:tcW w:type="dxa" w:w="2280"/>
+          </w:tcPr>
+          <w:p>
+            <w:r>
+              <w:rPr>
+                <w:rFonts w:ascii="Times New Roman" w:hAnsi="Times New Roman"/>
+                <w:sz w:val="20"/>
+              </w:rPr>
+              <w:t>Sugerido, próxima etapa natural</w:t>
+            </w:r>
+          </w:p>
+        </w:tc>
+        <w:tc>
+          <w:tcPr>
+            <w:tcW w:type="dxa" w:w="2280"/>
+          </w:tcPr>
+          <w:p>
+            <w:r>
+              <w:rPr>
+                <w:rFonts w:ascii="Times New Roman" w:hAnsi="Times New Roman"/>
+                <w:sz w:val="20"/>
+              </w:rPr>
+              <w:t>—</w:t>
+            </w:r>
+          </w:p>
+        </w:tc>
+        <w:tc>
+          <w:tcPr>
+            <w:tcW w:type="dxa" w:w="2280"/>
+          </w:tcPr>
+          <w:p>
+            <w:r>
+              <w:rPr>
+                <w:rFonts w:ascii="Times New Roman" w:hAnsi="Times New Roman"/>
+                <w:sz w:val="20"/>
+              </w:rPr>
+              <w:t>Decisão do grupo/laboratório; comparar com Monteiro (2019)/Rinaldi (2021, 2026)</w:t>
+            </w:r>
+          </w:p>
+        </w:tc>
+      </w:tr>
     </w:tbl>
     <w:p>
       <w:pPr/>
@@ -2590,16 +3057,16 @@
         <w:jc w:val="both"/>
       </w:pPr>
       <w:r>
-        <w:t xml:space="preserve">Buchfink, B., Xie, C., Huson, D.H. (2021). Sensitive protein alignments at tree-of-life scale using DIAMOND. </w:t>
+        <w:t xml:space="preserve">Bernhofer, M., Rost, B. (2022). TMbed: transmembrane proteins predicted through language model embeddings. </w:t>
       </w:r>
       <w:r>
         <w:rPr>
           <w:i/>
         </w:rPr>
-        <w:t>Nature Methods</w:t>
-      </w:r>
-      <w:r>
-        <w:t>, 18, 366–368. https://doi.org/10.1038/s41592-021-01101-x</w:t>
+        <w:t>BMC Bioinformatics</w:t>
+      </w:r>
+      <w:r>
+        <w:t>, 23, 326. https://doi.org/10.1186/s12859-022-04873-x</w:t>
       </w:r>
     </w:p>
     <w:p>
@@ -2607,16 +3074,16 @@
         <w:jc w:val="both"/>
       </w:pPr>
       <w:r>
-        <w:t xml:space="preserve">Cantalapiedra, C.P. et al. (2021). eggNOG-mapper v2: functional annotation, orthology assignments, and domain prediction at the metagenomic scale. </w:t>
+        <w:t xml:space="preserve">Buchfink, B., Xie, C., Huson, D.H. (2021). Sensitive protein alignments at tree-of-life scale using DIAMOND. </w:t>
       </w:r>
       <w:r>
         <w:rPr>
           <w:i/>
         </w:rPr>
-        <w:t>Molecular Biology and Evolution</w:t>
-      </w:r>
-      <w:r>
-        <w:t>, 38(12), 5825–5829. https://doi.org/10.1093/molbev/msab293</w:t>
+        <w:t>Nature Methods</w:t>
+      </w:r>
+      <w:r>
+        <w:t>, 18, 366–368. https://doi.org/10.1038/s41592-021-01101-x</w:t>
       </w:r>
     </w:p>
     <w:p>
@@ -2624,25 +3091,16 @@
         <w:jc w:val="both"/>
       </w:pPr>
       <w:r>
-        <w:t xml:space="preserve">Cornara, D. et al. (2017). Spittlebugs as vectors of </w:t>
+        <w:t xml:space="preserve">Cantalapiedra, C.P. et al. (2021). eggNOG-mapper v2: functional annotation, orthology assignments, and domain prediction at the metagenomic scale. </w:t>
       </w:r>
       <w:r>
         <w:rPr>
           <w:i/>
         </w:rPr>
-        <w:t>Xylella fastidiosa</w:t>
-      </w:r>
-      <w:r>
-        <w:t xml:space="preserve"> in olive orchards in Italy. </w:t>
-      </w:r>
-      <w:r>
-        <w:rPr>
-          <w:i/>
-        </w:rPr>
-        <w:t>Journal of Pest Science</w:t>
-      </w:r>
-      <w:r>
-        <w:t>, 90, 521–530. https://doi.org/10.1007/s10340-016-0793-0</w:t>
+        <w:t>Molecular Biology and Evolution</w:t>
+      </w:r>
+      <w:r>
+        <w:t>, 38(12), 5825–5829. https://doi.org/10.1093/molbev/msab293</w:t>
       </w:r>
     </w:p>
     <w:p>
@@ -2650,16 +3108,16 @@
         <w:jc w:val="both"/>
       </w:pPr>
       <w:r>
-        <w:t xml:space="preserve">Cornara, D. et al. (2018). EPG combined with micro-CT and video recording reveals new insights on the feeding behavior of </w:t>
+        <w:t xml:space="preserve">Cornara, D. et al. (2017). Spittlebugs as vectors of </w:t>
       </w:r>
       <w:r>
         <w:rPr>
           <w:i/>
         </w:rPr>
-        <w:t>Philaenus spumarius</w:t>
-      </w:r>
-      <w:r>
-        <w:t xml:space="preserve">. </w:t>
+        <w:t>Xylella fastidiosa</w:t>
+      </w:r>
+      <w:r>
+        <w:t xml:space="preserve"> in olive orchards in Italy. </w:t>
       </w:r>
       <w:r>
         <w:rPr>
@@ -2668,7 +3126,7 @@
         <w:t>Journal of Pest Science</w:t>
       </w:r>
       <w:r>
-        <w:t>, 91, 941–951.</w:t>
+        <w:t>, 90, 521–530. https://doi.org/10.1007/s10340-016-0793-0</w:t>
       </w:r>
     </w:p>
     <w:p>
@@ -2676,43 +3134,25 @@
         <w:jc w:val="both"/>
       </w:pPr>
       <w:r>
-        <w:t xml:space="preserve">Foieri, F., Decker-Franco, C., Marino de Remes Lenicov, A.M., Arneodo, J.D. (2022). First identification of bacterial endosymbionts in three South-American spittlebug pests: </w:t>
+        <w:t xml:space="preserve">Cornara, D. et al. (2018). EPG combined with micro-CT and video recording reveals new insights on the feeding behavior of </w:t>
       </w:r>
       <w:r>
         <w:rPr>
           <w:i/>
         </w:rPr>
-        <w:t>Notozulia entreriana</w:t>
-      </w:r>
-      <w:r>
-        <w:t xml:space="preserve">, </w:t>
+        <w:t>Philaenus spumarius</w:t>
+      </w:r>
+      <w:r>
+        <w:t xml:space="preserve">. </w:t>
       </w:r>
       <w:r>
         <w:rPr>
           <w:i/>
         </w:rPr>
-        <w:t>Deois mourei</w:t>
-      </w:r>
-      <w:r>
-        <w:t xml:space="preserve"> and </w:t>
-      </w:r>
-      <w:r>
-        <w:rPr>
-          <w:i/>
-        </w:rPr>
-        <w:t>Deois knoblauchii</w:t>
-      </w:r>
-      <w:r>
-        <w:t xml:space="preserve">. </w:t>
-      </w:r>
-      <w:r>
-        <w:rPr>
-          <w:i/>
-        </w:rPr>
-        <w:t>Bulletin of Insectology</w:t>
-      </w:r>
-      <w:r>
-        <w:t>.</w:t>
+        <w:t>Journal of Pest Science</w:t>
+      </w:r>
+      <w:r>
+        <w:t>, 91, 941–951.</w:t>
       </w:r>
     </w:p>
     <w:p>
@@ -2720,16 +3160,43 @@
         <w:jc w:val="both"/>
       </w:pPr>
       <w:r>
-        <w:t xml:space="preserve">Grabherr, M.G. et al. (2011). Full-length transcriptome assembly from RNA-Seq data without a reference genome. </w:t>
+        <w:t xml:space="preserve">Foieri, F., Decker-Franco, C., Marino de Remes Lenicov, A.M., Arneodo, J.D. (2022). First identification of bacterial endosymbionts in three South-American spittlebug pests: </w:t>
       </w:r>
       <w:r>
         <w:rPr>
           <w:i/>
         </w:rPr>
-        <w:t>Nature Biotechnology</w:t>
-      </w:r>
-      <w:r>
-        <w:t>, 29(7), 644–652. https://doi.org/10.1038/nbt.1883</w:t>
+        <w:t>Notozulia entreriana</w:t>
+      </w:r>
+      <w:r>
+        <w:t xml:space="preserve">, </w:t>
+      </w:r>
+      <w:r>
+        <w:rPr>
+          <w:i/>
+        </w:rPr>
+        <w:t>Deois mourei</w:t>
+      </w:r>
+      <w:r>
+        <w:t xml:space="preserve"> and </w:t>
+      </w:r>
+      <w:r>
+        <w:rPr>
+          <w:i/>
+        </w:rPr>
+        <w:t>Deois knoblauchii</w:t>
+      </w:r>
+      <w:r>
+        <w:t xml:space="preserve">. </w:t>
+      </w:r>
+      <w:r>
+        <w:rPr>
+          <w:i/>
+        </w:rPr>
+        <w:t>Bulletin of Insectology</w:t>
+      </w:r>
+      <w:r>
+        <w:t>.</w:t>
       </w:r>
     </w:p>
     <w:p>
@@ -2737,16 +3204,16 @@
         <w:jc w:val="both"/>
       </w:pPr>
       <w:r>
-        <w:t xml:space="preserve">Hernandez, C.A. et al. (2022). Spittlebugs (Hemiptera: Cercopidae): integrated pest management on gramineous crops in the Neotropical ecozone. </w:t>
+        <w:t xml:space="preserve">Grabherr, M.G. et al. (2011). Full-length transcriptome assembly from RNA-Seq data without a reference genome. </w:t>
       </w:r>
       <w:r>
         <w:rPr>
           <w:i/>
         </w:rPr>
-        <w:t>Frontiers in Sustainable Food Systems</w:t>
-      </w:r>
-      <w:r>
-        <w:t>, 6, 891417. https://doi.org/10.3389/fsufs.2022.891417</w:t>
+        <w:t>Nature Biotechnology</w:t>
+      </w:r>
+      <w:r>
+        <w:t>, 29(7), 644–652. https://doi.org/10.1038/nbt.1883</w:t>
       </w:r>
     </w:p>
     <w:p>
@@ -2754,16 +3221,16 @@
         <w:jc w:val="both"/>
       </w:pPr>
       <w:r>
-        <w:t xml:space="preserve">Koga, R., Moran, N.A. (2014). Swapping symbionts in spittlebugs: evolutionary replacement of a reduced genome symbiont. </w:t>
+        <w:t xml:space="preserve">Hernandez, C.A. et al. (2022). Spittlebugs (Hemiptera: Cercopidae): integrated pest management on gramineous crops in the Neotropical ecozone. </w:t>
       </w:r>
       <w:r>
         <w:rPr>
           <w:i/>
         </w:rPr>
-        <w:t>The ISME Journal</w:t>
-      </w:r>
-      <w:r>
-        <w:t>, 8, 1237–1249. https://doi.org/10.1038/ismej.2013.235</w:t>
+        <w:t>Frontiers in Sustainable Food Systems</w:t>
+      </w:r>
+      <w:r>
+        <w:t>, 6, 891417. https://doi.org/10.3389/fsufs.2022.891417</w:t>
       </w:r>
     </w:p>
     <w:p>
@@ -2771,16 +3238,16 @@
         <w:jc w:val="both"/>
       </w:pPr>
       <w:r>
-        <w:t xml:space="preserve">Manni, M. et al. (2021). BUSCO update: novel and streamlined workflows along with broader and deeper phylogenetic coverage for scoring of eukaryotic, prokaryotic, and viral genomes. </w:t>
+        <w:t xml:space="preserve">Karlicki, M., Antonowicz, S., Karnkowska, A. (2022). Tiara: deep learning-based classification system for eukaryotic sequences. </w:t>
       </w:r>
       <w:r>
         <w:rPr>
           <w:i/>
         </w:rPr>
-        <w:t>Molecular Biology and Evolution</w:t>
-      </w:r>
-      <w:r>
-        <w:t>, 38(10), 4647–4654. https://doi.org/10.1093/molbev/msab199</w:t>
+        <w:t>Bioinformatics</w:t>
+      </w:r>
+      <w:r>
+        <w:t>, 38(2), 344–350. https://doi.org/10.1093/bioinformatics/btab672</w:t>
       </w:r>
     </w:p>
     <w:p>
@@ -2788,16 +3255,16 @@
         <w:jc w:val="both"/>
       </w:pPr>
       <w:r>
-        <w:t xml:space="preserve">McCutcheon, J.P., Moran, N.A. (2007). Parallel genomic evolution and metabolic interdependence in an ancient symbiosis. </w:t>
+        <w:t xml:space="preserve">Koga, R., Moran, N.A. (2014). Swapping symbionts in spittlebugs: evolutionary replacement of a reduced genome symbiont. </w:t>
       </w:r>
       <w:r>
         <w:rPr>
           <w:i/>
         </w:rPr>
-        <w:t>PNAS</w:t>
-      </w:r>
-      <w:r>
-        <w:t>, 104(49), 19392–19397. https://doi.org/10.1073/pnas.0708855104</w:t>
+        <w:t>The ISME Journal</w:t>
+      </w:r>
+      <w:r>
+        <w:t>, 8, 1237–1249. https://doi.org/10.1038/ismej.2013.235</w:t>
       </w:r>
     </w:p>
     <w:p>
@@ -2805,16 +3272,16 @@
         <w:jc w:val="both"/>
       </w:pPr>
       <w:r>
-        <w:t xml:space="preserve">Mistry, J. et al. (2021). Pfam: the protein families database in 2021. </w:t>
+        <w:t xml:space="preserve">Manni, M. et al. (2021). BUSCO update: novel and streamlined workflows along with broader and deeper phylogenetic coverage for scoring of eukaryotic, prokaryotic, and viral genomes. </w:t>
       </w:r>
       <w:r>
         <w:rPr>
           <w:i/>
         </w:rPr>
-        <w:t>Nucleic Acids Research</w:t>
-      </w:r>
-      <w:r>
-        <w:t>, 49(D1), D412–D419. https://doi.org/10.1093/nar/gkaa913</w:t>
+        <w:t>Molecular Biology and Evolution</w:t>
+      </w:r>
+      <w:r>
+        <w:t>, 38(10), 4647–4654. https://doi.org/10.1093/molbev/msab199</w:t>
       </w:r>
     </w:p>
     <w:p>
@@ -2822,16 +3289,16 @@
         <w:jc w:val="both"/>
       </w:pPr>
       <w:r>
-        <w:t>Monteiro, L.P. (2019). Caracterização molecular da interação das cigarrinhas-das-pastagens (</w:t>
+        <w:t xml:space="preserve">McCutcheon, J.P., Moran, N.A. (2007). Parallel genomic evolution and metabolic interdependence in an ancient symbiosis. </w:t>
       </w:r>
       <w:r>
         <w:rPr>
           <w:i/>
         </w:rPr>
-        <w:t>Mahanarva spectabilis</w:t>
-      </w:r>
-      <w:r>
-        <w:t>) com diferentes forrageiras. Dissertação de Mestrado, Universidade Federal de Viçosa.</w:t>
+        <w:t>PNAS</w:t>
+      </w:r>
+      <w:r>
+        <w:t>, 104(49), 19392–19397. https://doi.org/10.1073/pnas.0708855104</w:t>
       </w:r>
     </w:p>
     <w:p>
@@ -2839,7 +3306,16 @@
         <w:jc w:val="both"/>
       </w:pPr>
       <w:r>
-        <w:t>Rinaldi, A.J. (2021). Análise de componentes moleculares da espuma e da toxina presente na glândula salivar de cigarrinha das pastagens. Dissertação de Mestrado, Universidade Federal de Viçosa.</w:t>
+        <w:t xml:space="preserve">Mistry, J. et al. (2021). Pfam: the protein families database in 2021. </w:t>
+      </w:r>
+      <w:r>
+        <w:rPr>
+          <w:i/>
+        </w:rPr>
+        <w:t>Nucleic Acids Research</w:t>
+      </w:r>
+      <w:r>
+        <w:t>, 49(D1), D412–D419. https://doi.org/10.1093/nar/gkaa913</w:t>
       </w:r>
     </w:p>
     <w:p>
@@ -2847,7 +3323,7 @@
         <w:jc w:val="both"/>
       </w:pPr>
       <w:r>
-        <w:t xml:space="preserve">Rinaldi, A.J. et al. (2026). Molecular and structural characterization of foam proteins from </w:t>
+        <w:t>Monteiro, L.P. (2019). Caracterização molecular da interação das cigarrinhas-das-pastagens (</w:t>
       </w:r>
       <w:r>
         <w:rPr>
@@ -2856,16 +3332,7 @@
         <w:t>Mahanarva spectabilis</w:t>
       </w:r>
       <w:r>
-        <w:t xml:space="preserve"> (Distant, 1909) (Hemiptera: Cercopidae) nymphs reveals adaptive features and potential targets for pest control. </w:t>
-      </w:r>
-      <w:r>
-        <w:rPr>
-          <w:i/>
-        </w:rPr>
-        <w:t>Archives of Insect Biochemistry and Physiology</w:t>
-      </w:r>
-      <w:r>
-        <w:t>.</w:t>
+        <w:t>) com diferentes forrageiras. Dissertação de Mestrado, Universidade Federal de Viçosa.</w:t>
       </w:r>
     </w:p>
     <w:p>
@@ -2873,7 +3340,7 @@
         <w:jc w:val="both"/>
       </w:pPr>
       <w:r>
-        <w:t>Sotelo, G., Cardona, C. (2001). [Sintomatologia e biologia de cigarrinhas-das-pastagens]. Apud Hernandez et al. (2022).</w:t>
+        <w:t>Rinaldi, A.J. (2021). Análise de componentes moleculares da espuma e da toxina presente na glândula salivar de cigarrinha das pastagens. Dissertação de Mestrado, Universidade Federal de Viçosa.</w:t>
       </w:r>
     </w:p>
     <w:p>
@@ -2881,7 +3348,16 @@
         <w:jc w:val="both"/>
       </w:pPr>
       <w:r>
-        <w:t>Thompson, V., González, R. (2005). [Danos de cigarrinhas em gramíneas forrageiras]. Apud Hernandez et al. (2022).</w:t>
+        <w:t xml:space="preserve">Pronk, L.J.U., Medema, M.H. (2022). Whokaryote: distinguishing eukaryotic and prokaryotic contigs in metagenomes based on gene structure. </w:t>
+      </w:r>
+      <w:r>
+        <w:rPr>
+          <w:i/>
+        </w:rPr>
+        <w:t>Microbial Genomics</w:t>
+      </w:r>
+      <w:r>
+        <w:t>, 8(5), 000823. https://doi.org/10.1099/mgen.0.000823</w:t>
       </w:r>
     </w:p>
     <w:p>
@@ -2889,7 +3365,66 @@
         <w:jc w:val="both"/>
       </w:pPr>
       <w:r>
+        <w:t xml:space="preserve">Rinaldi, A.J. et al. (2026). Molecular and structural characterization of foam proteins from </w:t>
+      </w:r>
+      <w:r>
+        <w:rPr>
+          <w:i/>
+        </w:rPr>
+        <w:t>Mahanarva spectabilis</w:t>
+      </w:r>
+      <w:r>
+        <w:t xml:space="preserve"> (Distant, 1909) (Hemiptera: Cercopidae) nymphs reveals adaptive features and potential targets for pest control. </w:t>
+      </w:r>
+      <w:r>
+        <w:rPr>
+          <w:i/>
+        </w:rPr>
+        <w:t>Archives of Insect Biochemistry and Physiology</w:t>
+      </w:r>
+      <w:r>
+        <w:t>.</w:t>
+      </w:r>
+    </w:p>
+    <w:p>
+      <w:pPr>
+        <w:jc w:val="both"/>
+      </w:pPr>
+      <w:r>
+        <w:t>Sotelo, G., Cardona, C. (2001). [Sintomatologia e biologia de cigarrinhas-das-pastagens]. Apud Hernandez et al. (2022).</w:t>
+      </w:r>
+    </w:p>
+    <w:p>
+      <w:pPr>
+        <w:jc w:val="both"/>
+      </w:pPr>
+      <w:r>
+        <w:t>Thompson, V., González, R. (2005). [Danos de cigarrinhas em gramíneas forrageiras]. Apud Hernandez et al. (2022).</w:t>
+      </w:r>
+    </w:p>
+    <w:p>
+      <w:pPr>
+        <w:jc w:val="both"/>
+      </w:pPr>
+      <w:r>
         <w:t>Valério, J.R. et al. (2001). [Caracterização de sintomas de dano de cigarrinhas-das-pastagens]. Apud Hernandez et al. (2022).</w:t>
+      </w:r>
+    </w:p>
+    <w:p>
+      <w:pPr>
+        <w:jc w:val="both"/>
+      </w:pPr>
+      <w:r>
+        <w:t xml:space="preserve">Zheng, J., Ge, Q., Yan, Y., Zhang, X., Huang, L., Yin, Y. (2023). dbCAN3: automated carbohydrate-active enzyme and substrate annotation. </w:t>
+      </w:r>
+      <w:r>
+        <w:rPr>
+          <w:i/>
+        </w:rPr>
+        <w:t>Nucleic Acids Research</w:t>
+      </w:r>
+      <w:r>
+        <w:t>, 51(W1), W115–W121. https://doi.org/10.1093/nar/gkad328</w:t>
       </w:r>
     </w:p>
     <w:sectPr>

</xml_diff>